<commit_message>
docs(ops-manual): v3.6.1 — add Probability Worksheet as step 7 before CIO ratification
§1.5 flow updated from 10 to 11 steps. New step inserted between
Investment Memo and CIO ratification: Probability Worksheet
(Bear/Base/Bull weight assignment over Builder/Breaker IRRs + four
gates: hurdle ≥12%, asymmetry ≥2x, expected loss ≥-3%, downside ≥-20%).
Adds a new paragraph explaining where the worksheet lives (dashboard
tab), how the three IRRs are sourced, the 25/50/25 default, and that
its verdict is an input — not a substitute — to the CIO Journal Entry.

Cover bumped to v3.6.1. Dataroom index detail updated. File name
preserved (in-place revision).
</commit_message>
<xml_diff>
--- a/public/docs/2026-05_Operations_Manual_v3-6.docx
+++ b/public/docs/2026-05_Operations_Manual_v3-6.docx
@@ -38,7 +38,7 @@
           <w:b w:val="0"/>
           <w:sz w:val="22"/>
         </w:rPr>
-        <w:t>Version 3.6 — Mayo 2026</w:t>
+        <w:t>Version 3.6.1 — Mayo 2026</w:t>
       </w:r>
     </w:p>
     <w:p/>
@@ -1018,7 +1018,7 @@
           <w:rFonts w:ascii="Helvetica" w:hAnsi="Helvetica"/>
           <w:sz w:val="21"/>
         </w:rPr>
-        <w:t>El ciclo completo de una tesis sigue diez pasos: screening, pre-analisis, modelaje base (Columbia Model), Thesis Breaker (stress test cuantitativo), Munger Digital (filtro de conviccion conductual y narrativa que produce decision_inputs.json como puente directo a la ratificacion del CIO), Investment Memo de doce secciones (incluye Pre-Mortem como §10, firmado por el CIO con apoyo del Associate, y Thesis Kill Criteria como §11), ratificacion del CIO (BUY / FOLLOW / PASS), ejecucion, monitoreo trimestral via Re-Underwriting firmado por el CIO, y cierre cuando corresponda mediante Position Adjustment Memo o Position Close Memo.</w:t>
+        <w:t>El ciclo completo de una tesis sigue once pasos: screening, pre-analisis, modelaje base (Columbia Model), Thesis Breaker (stress test cuantitativo), Munger Digital (filtro de conviccion conductual y narrativa que produce decision_inputs.json como puente directo a la ratificacion del CIO), Investment Memo de doce secciones (incluye Pre-Mortem como §10, firmado por el CIO con apoyo del Associate, y Thesis Kill Criteria como §11), Probability Worksheet (asignacion de pesos Bear/Base/Bull sobre los IRRs del Builder y Breaker, con justificacion escrita y verificacion de los cuatro gates: hurdle ≥12%, asimetria ≥2x, expected loss ≥-3%, downside Bear ≥-20%), ratificacion del CIO (BUY / FOLLOW / PASS), ejecucion, monitoreo trimestral via Re-Underwriting firmado por el CIO, y cierre cuando corresponda mediante Position Adjustment Memo o Position Close Memo.</w:t>
       </w:r>
     </w:p>
     <w:p>
@@ -1031,6 +1031,18 @@
           <w:sz w:val="21"/>
         </w:rPr>
         <w:t>El Thesis Breaker y el Munger Digital son obligatorios en el primer analisis de cualquier compania nueva, antes de la ratificacion del CIO; ninguna tesis llega a decision sin haber pasado por ambos filtros en su evaluacion inicial. En el flujo trimestral posterior, ambos analisis se ejecutan a demanda solo cuando el CIO lo solicita por cambio material en la tesis o en el set narrativo.</w:t>
+      </w:r>
+    </w:p>
+    <w:p>
+      <w:pPr>
+        <w:spacing w:after="80"/>
+      </w:pPr>
+      <w:r>
+        <w:rPr>
+          <w:rFonts w:ascii="Helvetica" w:hAnsi="Helvetica"/>
+          <w:sz w:val="21"/>
+        </w:rPr>
+        <w:t xml:space="preserve">El Probability Worksheet vive en el dashboard de la compañia (tab Probability de /company.html) y es obligatorio en toda tesis nueva antes de la ratificacion del CIO. Sus tres IRRs provienen, en este orden: Base IRR del Columbia Model (impliedIrr auditado en Fase 4), Bear IRR de la seccion 6 del Thesis Breaker, Bull IRR del Thesis Builder. Cuando una tesis no tiene Builder aun, Bull cae al Base como placeholder explicito. La asignacion de pesos por defecto (25/50/25) debe modificarse cuando las probabilidades del CIO difieran del baseline, y el cambio queda guardado junto con la justificacion escrita adjunta al worksheet. El veredicto del worksheet (BUY CANDIDATE / BORDERLINE / REVISAR / PASS) no sustituye la decision del CIO; es un input cuantitativo al Journal Entry.</w:t>
       </w:r>
     </w:p>
     <w:p>

</xml_diff>